<commit_message>
Add tech badges & update skills
</commit_message>
<xml_diff>
--- a/src/assets/Rahni.docx
+++ b/src/assets/Rahni.docx
@@ -349,13 +349,13 @@
           <w:bCs w:val="1"/>
           <w:rtl w:val="0"/>
         </w:rPr>
-        <w:t xml:space="preserve">Programming Languages: </w:t>
-      </w:r>
-      <w:r>
-        <w:rPr>
-          <w:rtl w:val="0"/>
-        </w:rPr>
-        <w:t xml:space="preserve">JavaScript, TypeScript</w:t>
+        <w:t xml:space="preserve">Programming Languages:</w:t>
+      </w:r>
+      <w:r>
+        <w:rPr>
+          <w:rtl w:val="0"/>
+        </w:rPr>
+        <w:t xml:space="preserve"> TypeScript, JavaScript</w:t>
       </w:r>
     </w:p>
     <w:p>
@@ -384,7 +384,36 @@
         <w:rPr>
           <w:rtl w:val="0"/>
         </w:rPr>
-        <w:t xml:space="preserve">Node.js, Express.js, REST APIs, MongoDB, SQL, Cloudfare</w:t>
+        <w:t xml:space="preserve">Node.js, Express.js, REST APIs, MongoDB, SQL</w:t>
+      </w:r>
+    </w:p>
+    <w:p>
+      <w:pPr>
+        <w:rPr/>
+      </w:pPr>
+      <w:r>
+        <w:rPr>
+          <w:rtl w:val="0"/>
+        </w:rPr>
+      </w:r>
+    </w:p>
+    <w:p>
+      <w:pPr>
+        <w:rPr/>
+      </w:pPr>
+      <w:r>
+        <w:rPr>
+          <w:b w:val="1"/>
+          <w:bCs w:val="1"/>
+          <w:rtl w:val="0"/>
+        </w:rPr>
+        <w:t xml:space="preserve">Tools: </w:t>
+      </w:r>
+      <w:r>
+        <w:rPr>
+          <w:rtl w:val="0"/>
+        </w:rPr>
+        <w:t xml:space="preserve">Git, Jira, GitHub, Codex, ChatGPT, Claude, GitHub Copilot, Docker, Monday</w:t>
       </w:r>
     </w:p>
     <w:p>
@@ -414,35 +443,6 @@
           <w:rtl w:val="0"/>
         </w:rPr>
         <w:t xml:space="preserve"> WordPress, Shopify</w:t>
-      </w:r>
-    </w:p>
-    <w:p>
-      <w:pPr>
-        <w:rPr/>
-      </w:pPr>
-      <w:r>
-        <w:rPr>
-          <w:rtl w:val="0"/>
-        </w:rPr>
-      </w:r>
-    </w:p>
-    <w:p>
-      <w:pPr>
-        <w:rPr/>
-      </w:pPr>
-      <w:r>
-        <w:rPr>
-          <w:b w:val="1"/>
-          <w:bCs w:val="1"/>
-          <w:rtl w:val="0"/>
-        </w:rPr>
-        <w:t xml:space="preserve">Tools: </w:t>
-      </w:r>
-      <w:r>
-        <w:rPr>
-          <w:rtl w:val="0"/>
-        </w:rPr>
-        <w:t xml:space="preserve">Git, Jira, GitHub, Codex, ChatGPT, Claude, GitHub Copilot, Docker, Monday</w:t>
       </w:r>
     </w:p>
     <w:p>

</xml_diff>